<commit_message>
Add Ismael Noguera to project sheet
</commit_message>
<xml_diff>
--- a/entregables/Ficha-Tecnica-NBU.docx
+++ b/entregables/Ficha-Tecnica-NBU.docx
@@ -6,6 +6,7 @@
       <w:pPr>
         <w:pStyle w:val="Title"/>
         <w:keepNext/>
+        <w:pageBreakBefore w:val="0"/>
       </w:pPr>
       <w:r>
         <w:rPr>
@@ -19,6 +20,7 @@
     </w:p>
     <w:p>
       <w:pPr>
+        <w:pageBreakBefore w:val="0"/>
         <w:spacing w:after="200"/>
       </w:pPr>
       <w:r>
@@ -33,6 +35,7 @@
     <w:p>
       <w:pPr>
         <w:pStyle w:val="Heading1"/>
+        <w:pageBreakBefore w:val="0"/>
       </w:pPr>
       <w:r>
         <w:t>Información general</w:t>
@@ -268,22 +271,14 @@
             </w:tcMar>
           </w:tcPr>
           <w:p>
-            <w:pPr>
-              <w:spacing w:after="0" w:line="240" w:lineRule="auto"/>
-            </w:pPr>
-            <w:r/>
             <w:r>
-              <w:rPr>
-                <w:rFonts w:ascii="Arial" w:hAnsi="Arial"/>
-                <w:b w:val="0"/>
-                <w:color w:val="182B43"/>
-                <w:sz w:val="18"/>
-              </w:rPr>
               <w:t>Carlos Jose Maltes Martinez</w:t>
               <w:br/>
               <w:t>Verno Jose Chaves Lopez</w:t>
               <w:br/>
               <w:t>Dereck Sahid Davila Duarte</w:t>
+              <w:br/>
+              <w:t>Ismael Exequiel Noguera Arias</w:t>
             </w:r>
           </w:p>
         </w:tc>
@@ -330,17 +325,7 @@
             </w:tcMar>
           </w:tcPr>
           <w:p>
-            <w:pPr>
-              <w:spacing w:after="0" w:line="240" w:lineRule="auto"/>
-            </w:pPr>
-            <w:r/>
             <w:r>
-              <w:rPr>
-                <w:rFonts w:ascii="Arial" w:hAnsi="Arial"/>
-                <w:b w:val="0"/>
-                <w:color w:val="182B43"/>
-                <w:sz w:val="18"/>
-              </w:rPr>
               <w:t>Ing. Carlos Gaitán</w:t>
             </w:r>
           </w:p>
@@ -523,12 +508,14 @@
     </w:tbl>
     <w:p>
       <w:pPr>
+        <w:pageBreakBefore w:val="0"/>
         <w:spacing w:after="0"/>
       </w:pPr>
     </w:p>
     <w:p>
       <w:pPr>
         <w:pStyle w:val="Heading1"/>
+        <w:pageBreakBefore w:val="0"/>
       </w:pPr>
       <w:r>
         <w:t>Descripción</w:t>
@@ -536,6 +523,7 @@
     </w:p>
     <w:p>
       <w:pPr>
+        <w:pageBreakBefore w:val="0"/>
         <w:widowControl/>
       </w:pPr>
       <w:r>
@@ -549,6 +537,7 @@
     <w:p>
       <w:pPr>
         <w:pStyle w:val="Heading1"/>
+        <w:pageBreakBefore w:val="0"/>
       </w:pPr>
       <w:r>
         <w:t>Módulos funcionales</w:t>
@@ -861,12 +850,14 @@
     </w:tbl>
     <w:p>
       <w:pPr>
+        <w:pageBreakBefore w:val="0"/>
         <w:spacing w:after="0"/>
       </w:pPr>
     </w:p>
     <w:p>
       <w:pPr>
         <w:pStyle w:val="Heading1"/>
+        <w:pageBreakBefore w:val="0"/>
       </w:pPr>
       <w:r>
         <w:t>Tecnologías y arquitectura</w:t>
@@ -1237,17 +1228,20 @@
     </w:tbl>
     <w:p>
       <w:pPr>
+        <w:pageBreakBefore w:val="0"/>
         <w:spacing w:after="0"/>
       </w:pPr>
     </w:p>
     <w:p>
-      <w:r>
-        <w:br w:type="page"/>
-      </w:r>
+      <w:pPr>
+        <w:pageBreakBefore w:val="0"/>
+      </w:pPr>
+      <w:r/>
     </w:p>
     <w:p>
       <w:pPr>
         <w:pStyle w:val="Heading1"/>
+        <w:pageBreakBefore w:val="0"/>
       </w:pPr>
       <w:r>
         <w:t>Identidad visual</w:t>
@@ -1787,12 +1781,14 @@
     </w:tbl>
     <w:p>
       <w:pPr>
+        <w:pageBreakBefore w:val="0"/>
         <w:spacing w:after="0"/>
       </w:pPr>
     </w:p>
     <w:p>
       <w:pPr>
         <w:pStyle w:val="Heading1"/>
+        <w:pageBreakBefore w:val="0"/>
       </w:pPr>
       <w:r>
         <w:t>Desglose de avances</w:t>
@@ -2843,17 +2839,20 @@
     </w:tbl>
     <w:p>
       <w:pPr>
+        <w:pageBreakBefore w:val="0"/>
         <w:spacing w:after="0"/>
       </w:pPr>
     </w:p>
     <w:p>
-      <w:r>
-        <w:br w:type="page"/>
-      </w:r>
+      <w:pPr>
+        <w:pageBreakBefore w:val="0"/>
+      </w:pPr>
+      <w:r/>
     </w:p>
     <w:p>
       <w:pPr>
         <w:pStyle w:val="Heading2"/>
+        <w:pageBreakBefore w:val="0"/>
       </w:pPr>
       <w:r>
         <w:t>Cronograma semanal de referencia</w:t>
@@ -3651,11 +3650,13 @@
     </w:tbl>
     <w:p>
       <w:pPr>
+        <w:pageBreakBefore w:val="0"/>
         <w:spacing w:after="0"/>
       </w:pPr>
     </w:p>
     <w:p>
       <w:pPr>
+        <w:pageBreakBefore w:val="0"/>
         <w:widowControl/>
       </w:pPr>
       <w:r>
@@ -3669,6 +3670,7 @@
     <w:p>
       <w:pPr>
         <w:pStyle w:val="Heading1"/>
+        <w:pageBreakBefore w:val="0"/>
       </w:pPr>
       <w:r>
         <w:t>Entregables</w:t>
@@ -4294,17 +4296,20 @@
     </w:tbl>
     <w:p>
       <w:pPr>
+        <w:pageBreakBefore w:val="0"/>
         <w:spacing w:after="0"/>
       </w:pPr>
     </w:p>
     <w:p>
-      <w:r>
-        <w:br w:type="page"/>
-      </w:r>
+      <w:pPr>
+        <w:pageBreakBefore w:val="0"/>
+      </w:pPr>
+      <w:r/>
     </w:p>
     <w:p>
       <w:pPr>
         <w:pStyle w:val="Heading1"/>
+        <w:pageBreakBefore w:val="0"/>
       </w:pPr>
       <w:r>
         <w:t>Evaluación del proyecto</w:t>
@@ -4733,12 +4738,14 @@
     </w:tbl>
     <w:p>
       <w:pPr>
+        <w:pageBreakBefore w:val="0"/>
         <w:spacing w:after="0"/>
       </w:pPr>
     </w:p>
     <w:p>
       <w:pPr>
         <w:pStyle w:val="Heading1"/>
+        <w:pageBreakBefore w:val="0"/>
       </w:pPr>
       <w:r>
         <w:t>Firmas</w:t>
@@ -5058,18 +5065,8 @@
             </w:tcMar>
           </w:tcPr>
           <w:p>
-            <w:pPr>
-              <w:spacing w:after="0" w:line="240" w:lineRule="auto"/>
-            </w:pPr>
-            <w:r/>
             <w:r>
-              <w:rPr>
-                <w:rFonts w:ascii="Arial" w:hAnsi="Arial"/>
-                <w:b w:val="0"/>
-                <w:color w:val="182B43"/>
-                <w:sz w:val="14"/>
-              </w:rPr>
-              <w:t>Ing. Carlos Gaitán</w:t>
+              <w:t>Ismael Exequiel Noguera Arias</w:t>
             </w:r>
           </w:p>
         </w:tc>
@@ -5102,14 +5099,86 @@
           </w:p>
         </w:tc>
       </w:tr>
+      <w:tr>
+        <w:tc>
+          <w:tcPr>
+            <w:tcW w:type="dxa" w:w="3384"/>
+            <w:vAlign w:val="center"/>
+            <w:shd w:fill="FFFFFF"/>
+            <w:tcMar>
+              <w:top w:w="95" w:type="dxa"/>
+              <w:start w:w="115" w:type="dxa"/>
+              <w:bottom w:w="95" w:type="dxa"/>
+              <w:end w:w="115" w:type="dxa"/>
+            </w:tcMar>
+          </w:tcPr>
+          <w:p>
+            <w:r>
+              <w:t>Ing. Carlos Gaitán</w:t>
+            </w:r>
+          </w:p>
+        </w:tc>
+        <w:tc>
+          <w:tcPr>
+            <w:tcW w:type="dxa" w:w="1872"/>
+            <w:vAlign w:val="center"/>
+            <w:shd w:fill="FFFFFF"/>
+            <w:tcMar>
+              <w:top w:w="95" w:type="dxa"/>
+              <w:start w:w="115" w:type="dxa"/>
+              <w:bottom w:w="95" w:type="dxa"/>
+              <w:end w:w="115" w:type="dxa"/>
+            </w:tcMar>
+          </w:tcPr>
+          <w:p>
+            <w:r>
+              <w:t>__________</w:t>
+            </w:r>
+          </w:p>
+        </w:tc>
+        <w:tc>
+          <w:tcPr>
+            <w:tcW w:type="dxa" w:w="3384"/>
+            <w:vAlign w:val="center"/>
+            <w:shd w:fill="FFFFFF"/>
+            <w:tcMar>
+              <w:top w:w="95" w:type="dxa"/>
+              <w:start w:w="115" w:type="dxa"/>
+              <w:bottom w:w="95" w:type="dxa"/>
+              <w:end w:w="115" w:type="dxa"/>
+            </w:tcMar>
+          </w:tcPr>
+          <w:p>
+            <w:r/>
+          </w:p>
+        </w:tc>
+        <w:tc>
+          <w:tcPr>
+            <w:tcW w:type="dxa" w:w="1872"/>
+            <w:vAlign w:val="center"/>
+            <w:shd w:fill="FFFFFF"/>
+            <w:tcMar>
+              <w:top w:w="95" w:type="dxa"/>
+              <w:start w:w="115" w:type="dxa"/>
+              <w:bottom w:w="95" w:type="dxa"/>
+              <w:end w:w="115" w:type="dxa"/>
+            </w:tcMar>
+          </w:tcPr>
+          <w:p>
+            <w:r/>
+          </w:p>
+        </w:tc>
+      </w:tr>
     </w:tbl>
     <w:p>
       <w:pPr>
+        <w:pageBreakBefore w:val="0"/>
         <w:spacing w:after="0"/>
       </w:pPr>
     </w:p>
     <w:p>
       <w:pPr>
+        <w:pageBreakBefore w:val="0"/>
         <w:widowControl/>
       </w:pPr>
       <w:r>

</xml_diff>